<commit_message>
Rebuild the resumes and add the LinkedIn profile source
Every resume and role version now gives the Bay Area as location, ends MyStage in June 2026 and
carries the corrected SRP line. resume/linkedin.md holds the full LinkedIn copy, sized to
LinkedIn's limits.
</commit_message>
<xml_diff>
--- a/public/Archit_Agrawal_AI_Software_Engineer_Resume.docx
+++ b/public/Archit_Agrawal_AI_Software_Engineer_Resume.docx
@@ -29,7 +29,7 @@
           <w:szCs w:val="18"/>
           <w:color w:val="111111"/>
         </w:rPr>
-        <w:t xml:space="preserve">Phoenix, AZ</w:t>
+        <w:t xml:space="preserve">San Francisco Bay Area</w:t>
       </w:r>
       <w:r>
         <w:rPr>
@@ -696,7 +696,7 @@
           <w:b/>
           <w:color w:val="111111"/>
         </w:rPr>
-        <w:t xml:space="preserve">07/2025 - 05/2026</w:t>
+        <w:t xml:space="preserve">07/2025 - 06/2026</w:t>
       </w:r>
     </w:p>
     <w:p>
@@ -1940,40 +1940,40 @@
           <w:szCs w:val="19"/>
           <w:color w:val="111111"/>
         </w:rPr>
-        <w:t xml:space="preserve">Reverse-engineered an undocumented utility portal into a read-only TypeScript MCP server with Zod-validated tool schemas, normalized meter data and typed errors an agent can act on.</w:t>
-      </w:r>
-    </w:p>
-    <w:p>
-      <w:pPr>
-        <w:spacing w:before="0" w:after="10" w:line="240" w:lineRule="auto"/>
-        <w:ind w:left="200" w:hanging="200"/>
-      </w:pPr>
-      <w:r>
-        <w:rPr>
-          <w:rFonts w:ascii="Lato" w:hAnsi="Lato" w:cs="Lato"/>
-          <w:sz w:val="19"/>
-          <w:szCs w:val="19"/>
-          <w:color w:val="111111"/>
-        </w:rPr>
-        <w:t xml:space="preserve">•</w:t>
-      </w:r>
-      <w:r>
-        <w:rPr>
-          <w:rFonts w:ascii="Lato" w:hAnsi="Lato" w:cs="Lato"/>
-          <w:sz w:val="19"/>
-          <w:szCs w:val="19"/>
-          <w:color w:val="111111"/>
-        </w:rPr>
-        <w:t xml:space="preserve">  </w:t>
-      </w:r>
-      <w:r>
-        <w:rPr>
-          <w:rFonts w:ascii="Lato" w:hAnsi="Lato" w:cs="Lato"/>
-          <w:sz w:val="19"/>
-          <w:szCs w:val="19"/>
-          <w:color w:val="111111"/>
-        </w:rPr>
-        <w:t xml:space="preserve">Kept every tool read-only, so an agent exploring an undocumented portal cannot change a billing setting.</w:t>
+        <w:t xml:space="preserve">Built a Python MCP server on FastMCP that logs into an undocumented utility portal and gives AI agents 7 tools and 4 analysis prompts for billing, usage, payments and outages, with a one-click setup wizard.</w:t>
+      </w:r>
+    </w:p>
+    <w:p>
+      <w:pPr>
+        <w:spacing w:before="0" w:after="10" w:line="240" w:lineRule="auto"/>
+        <w:ind w:left="200" w:hanging="200"/>
+      </w:pPr>
+      <w:r>
+        <w:rPr>
+          <w:rFonts w:ascii="Lato" w:hAnsi="Lato" w:cs="Lato"/>
+          <w:sz w:val="19"/>
+          <w:szCs w:val="19"/>
+          <w:color w:val="111111"/>
+        </w:rPr>
+        <w:t xml:space="preserve">•</w:t>
+      </w:r>
+      <w:r>
+        <w:rPr>
+          <w:rFonts w:ascii="Lato" w:hAnsi="Lato" w:cs="Lato"/>
+          <w:sz w:val="19"/>
+          <w:szCs w:val="19"/>
+          <w:color w:val="111111"/>
+        </w:rPr>
+        <w:t xml:space="preserve">  </w:t>
+      </w:r>
+      <w:r>
+        <w:rPr>
+          <w:rFonts w:ascii="Lato" w:hAnsi="Lato" w:cs="Lato"/>
+          <w:sz w:val="19"/>
+          <w:szCs w:val="19"/>
+          <w:color w:val="111111"/>
+        </w:rPr>
+        <w:t xml:space="preserve">Reverse-engineered the portal's login flow and API calls, since the utility publishes no API documentation.</w:t>
       </w:r>
     </w:p>
     <w:p>

</xml_diff>

<commit_message>
Frame EdPlus work as any structured dataset and show Zeus as one role
- EdPlus bullets describe the platform as working on any structured
  dataset; survey stays only where it names the 51,280-respondent dataset
- Zeus renders as a single Software Engineer role; drop the progression
  subtitle and its build helper
- Keep the job-description research file out of the public repo
</commit_message>
<xml_diff>
--- a/public/Archit_Agrawal_AI_Software_Engineer_Resume.docx
+++ b/public/Archit_Agrawal_AI_Software_Engineer_Resume.docx
@@ -239,40 +239,40 @@
           <w:szCs w:val="22"/>
           <w:color w:val="111111"/>
         </w:rPr>
-        <w:t xml:space="preserve">Own architecture and delivery of an AI survey analytics platform on AWS Bedrock and Step Functions, with cited answers and deterministic calculations.</w:t>
-      </w:r>
-    </w:p>
-    <w:p>
-      <w:pPr>
-        <w:spacing w:before="0" w:after="10" w:line="240" w:lineRule="auto"/>
-        <w:ind w:left="200" w:hanging="200"/>
-      </w:pPr>
-      <w:r>
-        <w:rPr>
-          <w:rFonts w:ascii="Lato" w:hAnsi="Lato" w:cs="Lato"/>
-          <w:sz w:val="22"/>
-          <w:szCs w:val="22"/>
-          <w:color w:val="111111"/>
-        </w:rPr>
-        <w:t xml:space="preserve">•</w:t>
-      </w:r>
-      <w:r>
-        <w:rPr>
-          <w:rFonts w:ascii="Lato" w:hAnsi="Lato" w:cs="Lato"/>
-          <w:sz w:val="22"/>
-          <w:szCs w:val="22"/>
-          <w:color w:val="111111"/>
-        </w:rPr>
-        <w:t xml:space="preserve">  </w:t>
-      </w:r>
-      <w:r>
-        <w:rPr>
-          <w:rFonts w:ascii="Lato" w:hAnsi="Lato" w:cs="Lato"/>
-          <w:sz w:val="22"/>
-          <w:szCs w:val="22"/>
-          <w:color w:val="111111"/>
-        </w:rPr>
-        <w:t xml:space="preserve">Built a survey analytics application with a Nuxt frontend and NestJS backend, sharing TypeScript contracts across 70 API routes.</w:t>
+        <w:t xml:space="preserve">Own architecture and delivery of an AI analytics platform for any structured dataset on AWS Bedrock and Step Functions, with cited answers and deterministic calculations.</w:t>
+      </w:r>
+    </w:p>
+    <w:p>
+      <w:pPr>
+        <w:spacing w:before="0" w:after="10" w:line="240" w:lineRule="auto"/>
+        <w:ind w:left="200" w:hanging="200"/>
+      </w:pPr>
+      <w:r>
+        <w:rPr>
+          <w:rFonts w:ascii="Lato" w:hAnsi="Lato" w:cs="Lato"/>
+          <w:sz w:val="22"/>
+          <w:szCs w:val="22"/>
+          <w:color w:val="111111"/>
+        </w:rPr>
+        <w:t xml:space="preserve">•</w:t>
+      </w:r>
+      <w:r>
+        <w:rPr>
+          <w:rFonts w:ascii="Lato" w:hAnsi="Lato" w:cs="Lato"/>
+          <w:sz w:val="22"/>
+          <w:szCs w:val="22"/>
+          <w:color w:val="111111"/>
+        </w:rPr>
+        <w:t xml:space="preserve">  </w:t>
+      </w:r>
+      <w:r>
+        <w:rPr>
+          <w:rFonts w:ascii="Lato" w:hAnsi="Lato" w:cs="Lato"/>
+          <w:sz w:val="22"/>
+          <w:szCs w:val="22"/>
+          <w:color w:val="111111"/>
+        </w:rPr>
+        <w:t xml:space="preserve">Built the platform's web application with a Nuxt frontend and NestJS backend, sharing TypeScript contracts across 70 API routes.</w:t>
       </w:r>
     </w:p>
     <w:p>
@@ -338,7 +338,7 @@
           <w:szCs w:val="22"/>
           <w:color w:val="111111"/>
         </w:rPr>
-        <w:t xml:space="preserve">Cut incorrect answers 85% in an evaluation against 164 published survey figures by adding answer verification before display.</w:t>
+        <w:t xml:space="preserve">Cut incorrect answers 85% in an evaluation against 164 published benchmark figures by adding answer verification before display.</w:t>
       </w:r>
     </w:p>
     <w:p>
@@ -437,7 +437,7 @@
           <w:szCs w:val="22"/>
           <w:color w:val="111111"/>
         </w:rPr>
-        <w:t xml:space="preserve">Increased recovery of reference headline findings from 13% to 52–59% on held-out surveys using LLM-selected analyses and deterministic calculations.</w:t>
+        <w:t xml:space="preserve">Increased recovery of reference headline findings from 13% to 52–59% on held-out datasets using LLM-selected analyses and deterministic calculations.</w:t>
       </w:r>
     </w:p>
     <w:p>
@@ -1239,7 +1239,7 @@
           <w:i/>
           <w:color w:val="111111"/>
         </w:rPr>
-        <w:t xml:space="preserve">Software Engineer | Intern Jan–Jun 2022; engineer Jun 2022–Jul 2023</w:t>
+        <w:t xml:space="preserve">Software Engineer</w:t>
       </w:r>
       <w:r>
         <w:tab/>

</xml_diff>

<commit_message>
Polish resume bullets across every role and fill the site's AI resume
- Clearer EdPlus results: quadrupled headline findings (13% to 52-59%),
  StatQA 68% against GPT-4o's best reported 64.83%, model choice moving
  labeling F1 33x more than pipeline design, 100% join integrity against
  a baseline that mislabeled 1 in 8 rows
- Lead AI bullet reordered so the platform, not the data, runs on Bedrock
- One-pagers with spare room gain their strongest missing bullets
- Site AI resume adds AiJockey, a KER latency bullet, the research rubric
  and a five-line skills list, so page 2 no longer ends a third empty
- Education locations match the roles: Tempe, AZ and Gandhinagar, India
</commit_message>
<xml_diff>
--- a/public/Archit_Agrawal_AI_Software_Engineer_Resume.docx
+++ b/public/Archit_Agrawal_AI_Software_Engineer_Resume.docx
@@ -239,7 +239,7 @@
           <w:szCs w:val="21"/>
           <w:color w:val="111111"/>
         </w:rPr>
-        <w:t xml:space="preserve">Own architecture and delivery of an AI analytics platform for any structured dataset on AWS Bedrock and Step Functions, with cited answers and deterministic calculations.</w:t>
+        <w:t xml:space="preserve">Own architecture and delivery of an AI analytics platform on AWS Bedrock and Step Functions that turns any structured dataset into cited, code-computed answers.</w:t>
       </w:r>
     </w:p>
     <w:p>
@@ -371,7 +371,7 @@
           <w:szCs w:val="21"/>
           <w:color w:val="111111"/>
         </w:rPr>
-        <w:t xml:space="preserve">Validated 25 statistical tests and six causal estimators against SciPy and statsmodels; achieved 68% on StatQA test selection.</w:t>
+        <w:t xml:space="preserve">Validated 25 statistical tests and six causal estimators against SciPy and statsmodels; scored 68% on a 100-question StatQA sample, against GPT-4o's best reported 64.83%.</w:t>
       </w:r>
     </w:p>
     <w:p>
@@ -437,40 +437,73 @@
           <w:szCs w:val="21"/>
           <w:color w:val="111111"/>
         </w:rPr>
-        <w:t xml:space="preserve">Increased recovery of reference headline findings from 13% to 52–59% on held-out datasets using LLM-selected analyses and deterministic calculations.</w:t>
-      </w:r>
-    </w:p>
-    <w:p>
-      <w:pPr>
-        <w:spacing w:before="0" w:after="10" w:line="248" w:lineRule="exact"/>
-        <w:ind w:left="200" w:hanging="200"/>
-      </w:pPr>
-      <w:r>
-        <w:rPr>
-          <w:rFonts w:ascii="Lato" w:hAnsi="Lato" w:cs="Lato"/>
-          <w:sz w:val="21"/>
-          <w:szCs w:val="21"/>
-          <w:color w:val="111111"/>
-        </w:rPr>
-        <w:t xml:space="preserve">•</w:t>
-      </w:r>
-      <w:r>
-        <w:rPr>
-          <w:rFonts w:ascii="Lato" w:hAnsi="Lato" w:cs="Lato"/>
-          <w:sz w:val="21"/>
-          <w:szCs w:val="21"/>
-          <w:color w:val="111111"/>
-        </w:rPr>
-        <w:t xml:space="preserve">  </w:t>
-      </w:r>
-      <w:r>
-        <w:rPr>
-          <w:rFonts w:ascii="Lato" w:hAnsi="Lato" w:cs="Lato"/>
-          <w:sz w:val="21"/>
-          <w:szCs w:val="21"/>
-          <w:color w:val="111111"/>
-        </w:rPr>
-        <w:t xml:space="preserve">Prevented mislabeled and dropped records with schema-constrained output and row correlation checks in the data-processing pipeline.</w:t>
+        <w:t xml:space="preserve">Quadrupled the headline findings automated reports recover, 13% to 52–59% on held-out datasets, by letting an LLM choose analyses while code computes every number.</w:t>
+      </w:r>
+    </w:p>
+    <w:p>
+      <w:pPr>
+        <w:spacing w:before="0" w:after="10" w:line="248" w:lineRule="exact"/>
+        <w:ind w:left="200" w:hanging="200"/>
+      </w:pPr>
+      <w:r>
+        <w:rPr>
+          <w:rFonts w:ascii="Lato" w:hAnsi="Lato" w:cs="Lato"/>
+          <w:sz w:val="21"/>
+          <w:szCs w:val="21"/>
+          <w:color w:val="111111"/>
+        </w:rPr>
+        <w:t xml:space="preserve">•</w:t>
+      </w:r>
+      <w:r>
+        <w:rPr>
+          <w:rFonts w:ascii="Lato" w:hAnsi="Lato" w:cs="Lato"/>
+          <w:sz w:val="21"/>
+          <w:szCs w:val="21"/>
+          <w:color w:val="111111"/>
+        </w:rPr>
+        <w:t xml:space="preserve">  </w:t>
+      </w:r>
+      <w:r>
+        <w:rPr>
+          <w:rFonts w:ascii="Lato" w:hAnsi="Lato" w:cs="Lato"/>
+          <w:sz w:val="21"/>
+          <w:szCs w:val="21"/>
+          <w:color w:val="111111"/>
+        </w:rPr>
+        <w:t xml:space="preserve">Reached 100% join integrity on repeat runs with schema-constrained LLM output and per-row IDs; the prior pipeline silently mislabeled 1 in 8 rows.</w:t>
+      </w:r>
+    </w:p>
+    <w:p>
+      <w:pPr>
+        <w:spacing w:before="0" w:after="10" w:line="248" w:lineRule="exact"/>
+        <w:ind w:left="200" w:hanging="200"/>
+      </w:pPr>
+      <w:r>
+        <w:rPr>
+          <w:rFonts w:ascii="Lato" w:hAnsi="Lato" w:cs="Lato"/>
+          <w:sz w:val="21"/>
+          <w:szCs w:val="21"/>
+          <w:color w:val="111111"/>
+        </w:rPr>
+        <w:t xml:space="preserve">•</w:t>
+      </w:r>
+      <w:r>
+        <w:rPr>
+          <w:rFonts w:ascii="Lato" w:hAnsi="Lato" w:cs="Lato"/>
+          <w:sz w:val="21"/>
+          <w:szCs w:val="21"/>
+          <w:color w:val="111111"/>
+        </w:rPr>
+        <w:t xml:space="preserve">  </w:t>
+      </w:r>
+      <w:r>
+        <w:rPr>
+          <w:rFonts w:ascii="Lato" w:hAnsi="Lato" w:cs="Lato"/>
+          <w:sz w:val="21"/>
+          <w:szCs w:val="21"/>
+          <w:color w:val="111111"/>
+        </w:rPr>
+        <w:t xml:space="preserve">Showed model choice moves labeling F1 33x more than pipeline design (0.230 vs 0.007), redirecting the team toward reliability.</w:t>
       </w:r>
     </w:p>
     <w:p>
@@ -1063,6 +1096,39 @@
     </w:p>
     <w:p>
       <w:pPr>
+        <w:spacing w:before="0" w:after="10" w:line="248" w:lineRule="exact"/>
+        <w:ind w:left="200" w:hanging="200"/>
+      </w:pPr>
+      <w:r>
+        <w:rPr>
+          <w:rFonts w:ascii="Lato" w:hAnsi="Lato" w:cs="Lato"/>
+          <w:sz w:val="21"/>
+          <w:szCs w:val="21"/>
+          <w:color w:val="111111"/>
+        </w:rPr>
+        <w:t xml:space="preserve">•</w:t>
+      </w:r>
+      <w:r>
+        <w:rPr>
+          <w:rFonts w:ascii="Lato" w:hAnsi="Lato" w:cs="Lato"/>
+          <w:sz w:val="21"/>
+          <w:szCs w:val="21"/>
+          <w:color w:val="111111"/>
+        </w:rPr>
+        <w:t xml:space="preserve">  </w:t>
+      </w:r>
+      <w:r>
+        <w:rPr>
+          <w:rFonts w:ascii="Lato" w:hAnsi="Lato" w:cs="Lato"/>
+          <w:sz w:val="21"/>
+          <w:szCs w:val="21"/>
+          <w:color w:val="111111"/>
+        </w:rPr>
+        <w:t xml:space="preserve">Designed a frame-level rubric for rigid-body motion, gravity, momentum and occlusion, and measured inter-rater agreement before trusting any aggregate score.</w:t>
+      </w:r>
+    </w:p>
+    <w:p>
+      <w:pPr>
         <w:keepNext/>
         <w:tabs>
           <w:tab w:val="right" w:pos="10656"/>
@@ -1193,6 +1259,39 @@
     </w:p>
     <w:p>
       <w:pPr>
+        <w:spacing w:before="0" w:after="10" w:line="248" w:lineRule="exact"/>
+        <w:ind w:left="200" w:hanging="200"/>
+      </w:pPr>
+      <w:r>
+        <w:rPr>
+          <w:rFonts w:ascii="Lato" w:hAnsi="Lato" w:cs="Lato"/>
+          <w:sz w:val="21"/>
+          <w:szCs w:val="21"/>
+          <w:color w:val="111111"/>
+        </w:rPr>
+        <w:t xml:space="preserve">•</w:t>
+      </w:r>
+      <w:r>
+        <w:rPr>
+          <w:rFonts w:ascii="Lato" w:hAnsi="Lato" w:cs="Lato"/>
+          <w:sz w:val="21"/>
+          <w:szCs w:val="21"/>
+          <w:color w:val="111111"/>
+        </w:rPr>
+        <w:t xml:space="preserve">  </w:t>
+      </w:r>
+      <w:r>
+        <w:rPr>
+          <w:rFonts w:ascii="Lato" w:hAnsi="Lato" w:cs="Lato"/>
+          <w:sz w:val="21"/>
+          <w:szCs w:val="21"/>
+          <w:color w:val="111111"/>
+        </w:rPr>
+        <w:t xml:space="preserve">Cut API latency from 198 to 20 ms with Redis caching and SQL rewrites, verified under simulated peak load with Locust.</w:t>
+      </w:r>
+    </w:p>
+    <w:p>
+      <w:pPr>
         <w:keepNext/>
         <w:tabs>
           <w:tab w:val="right" w:pos="10656"/>
@@ -1323,6 +1422,39 @@
     </w:p>
     <w:p>
       <w:pPr>
+        <w:spacing w:before="0" w:after="10" w:line="248" w:lineRule="exact"/>
+        <w:ind w:left="200" w:hanging="200"/>
+      </w:pPr>
+      <w:r>
+        <w:rPr>
+          <w:rFonts w:ascii="Lato" w:hAnsi="Lato" w:cs="Lato"/>
+          <w:sz w:val="21"/>
+          <w:szCs w:val="21"/>
+          <w:color w:val="111111"/>
+        </w:rPr>
+        <w:t xml:space="preserve">•</w:t>
+      </w:r>
+      <w:r>
+        <w:rPr>
+          <w:rFonts w:ascii="Lato" w:hAnsi="Lato" w:cs="Lato"/>
+          <w:sz w:val="21"/>
+          <w:szCs w:val="21"/>
+          <w:color w:val="111111"/>
+        </w:rPr>
+        <w:t xml:space="preserve">  </w:t>
+      </w:r>
+      <w:r>
+        <w:rPr>
+          <w:rFonts w:ascii="Lato" w:hAnsi="Lato" w:cs="Lato"/>
+          <w:sz w:val="21"/>
+          <w:szCs w:val="21"/>
+          <w:color w:val="111111"/>
+        </w:rPr>
+        <w:t xml:space="preserve">Built a Redis-backed desk-booking service used across 300+ offices at Fortune 500 companies.</w:t>
+      </w:r>
+    </w:p>
+    <w:p>
+      <w:pPr>
         <w:keepNext/>
         <w:pBdr>
           <w:bottom w:val="single" w:sz="4" w:space="1" w:color="999999"/>
@@ -1539,92 +1671,99 @@
     <w:p>
       <w:pPr>
         <w:keepNext/>
-        <w:pBdr>
-          <w:bottom w:val="single" w:sz="4" w:space="1" w:color="999999"/>
-        </w:pBdr>
-        <w:spacing w:before="120" w:after="40" w:line="240" w:lineRule="auto"/>
-      </w:pPr>
-      <w:r>
-        <w:rPr>
-          <w:rFonts w:ascii="Lato" w:hAnsi="Lato" w:cs="Lato"/>
-          <w:sz w:val="22"/>
-          <w:szCs w:val="22"/>
-          <w:b/>
-          <w:color w:val="111111"/>
-        </w:rPr>
-        <w:t xml:space="preserve">TECHNICAL SKILLS</w:t>
-      </w:r>
-    </w:p>
-    <w:p>
-      <w:pPr>
-        <w:spacing w:before="0" w:after="10" w:line="248" w:lineRule="exact"/>
-      </w:pPr>
-      <w:r>
-        <w:rPr>
-          <w:rFonts w:ascii="Lato" w:hAnsi="Lato" w:cs="Lato"/>
-          <w:sz w:val="21"/>
-          <w:szCs w:val="21"/>
-          <w:b/>
-          <w:color w:val="111111"/>
-        </w:rPr>
-        <w:t xml:space="preserve">Languages &amp; APIs: </w:t>
-      </w:r>
-      <w:r>
-        <w:rPr>
-          <w:rFonts w:ascii="Lato" w:hAnsi="Lato" w:cs="Lato"/>
-          <w:sz w:val="21"/>
-          <w:szCs w:val="21"/>
-          <w:color w:val="111111"/>
-        </w:rPr>
-        <w:t xml:space="preserve">Python, TypeScript, SQL, FastAPI, NestJS</w:t>
-      </w:r>
-    </w:p>
-    <w:p>
-      <w:pPr>
-        <w:spacing w:before="0" w:after="10" w:line="248" w:lineRule="exact"/>
-      </w:pPr>
-      <w:r>
-        <w:rPr>
-          <w:rFonts w:ascii="Lato" w:hAnsi="Lato" w:cs="Lato"/>
-          <w:sz w:val="21"/>
-          <w:szCs w:val="21"/>
-          <w:b/>
-          <w:color w:val="111111"/>
-        </w:rPr>
-        <w:t xml:space="preserve">AI &amp; Data: </w:t>
-      </w:r>
-      <w:r>
-        <w:rPr>
-          <w:rFonts w:ascii="Lato" w:hAnsi="Lato" w:cs="Lato"/>
-          <w:sz w:val="21"/>
-          <w:szCs w:val="21"/>
-          <w:color w:val="111111"/>
-        </w:rPr>
-        <w:t xml:space="preserve">LangGraph, RAG, LLM evaluation, MCP, PostgreSQL, pgvector, Neo4j</w:t>
-      </w:r>
-    </w:p>
-    <w:p>
-      <w:pPr>
-        <w:spacing w:before="0" w:after="10" w:line="248" w:lineRule="exact"/>
-      </w:pPr>
-      <w:r>
-        <w:rPr>
-          <w:rFonts w:ascii="Lato" w:hAnsi="Lato" w:cs="Lato"/>
-          <w:sz w:val="21"/>
-          <w:szCs w:val="21"/>
-          <w:b/>
-          <w:color w:val="111111"/>
-        </w:rPr>
-        <w:t xml:space="preserve">Cloud &amp; Quality: </w:t>
-      </w:r>
-      <w:r>
-        <w:rPr>
-          <w:rFonts w:ascii="Lato" w:hAnsi="Lato" w:cs="Lato"/>
-          <w:sz w:val="21"/>
-          <w:szCs w:val="21"/>
-          <w:color w:val="111111"/>
-        </w:rPr>
-        <w:t xml:space="preserve">AWS Bedrock, Step Functions, GCP Cloud Run, Docker, pytest</w:t>
+        <w:tabs>
+          <w:tab w:val="right" w:pos="10656"/>
+        </w:tabs>
+        <w:spacing w:before="60" w:after="0" w:line="248" w:lineRule="exact"/>
+      </w:pPr>
+      <w:r>
+        <w:rPr>
+          <w:rFonts w:ascii="Lato" w:hAnsi="Lato" w:cs="Lato"/>
+          <w:sz w:val="21"/>
+          <w:szCs w:val="21"/>
+          <w:b/>
+          <w:color w:val="111111"/>
+        </w:rPr>
+        <w:t xml:space="preserve">AiJockey – AI DJ Pipeline</w:t>
+      </w:r>
+      <w:r>
+        <w:tab/>
+      </w:r>
+      <w:r>
+        <w:rPr>
+          <w:rFonts w:ascii="Lato" w:hAnsi="Lato" w:cs="Lato"/>
+          <w:sz w:val="21"/>
+          <w:szCs w:val="21"/>
+          <w:b/>
+          <w:color w:val="111111"/>
+        </w:rPr>
+        <w:t xml:space="preserve">2025 - Present</w:t>
+      </w:r>
+    </w:p>
+    <w:p>
+      <w:pPr>
+        <w:spacing w:before="0" w:after="10" w:line="248" w:lineRule="exact"/>
+        <w:ind w:left="200" w:hanging="200"/>
+      </w:pPr>
+      <w:r>
+        <w:rPr>
+          <w:rFonts w:ascii="Lato" w:hAnsi="Lato" w:cs="Lato"/>
+          <w:sz w:val="21"/>
+          <w:szCs w:val="21"/>
+          <w:color w:val="111111"/>
+        </w:rPr>
+        <w:t xml:space="preserve">•</w:t>
+      </w:r>
+      <w:r>
+        <w:rPr>
+          <w:rFonts w:ascii="Lato" w:hAnsi="Lato" w:cs="Lato"/>
+          <w:sz w:val="21"/>
+          <w:szCs w:val="21"/>
+          <w:color w:val="111111"/>
+        </w:rPr>
+        <w:t xml:space="preserve">  </w:t>
+      </w:r>
+      <w:r>
+        <w:rPr>
+          <w:rFonts w:ascii="Lato" w:hAnsi="Lato" w:cs="Lato"/>
+          <w:sz w:val="21"/>
+          <w:szCs w:val="21"/>
+          <w:color w:val="111111"/>
+        </w:rPr>
+        <w:t xml:space="preserve">Built a PyTorch/FastAPI audio pipeline with stem separation, LLM transition planning and 25+ DSP transitions; ported inference to AMD MI300X.</w:t>
+      </w:r>
+    </w:p>
+    <w:p>
+      <w:pPr>
+        <w:spacing w:before="0" w:after="10" w:line="248" w:lineRule="exact"/>
+        <w:ind w:left="200" w:hanging="200"/>
+      </w:pPr>
+      <w:r>
+        <w:rPr>
+          <w:rFonts w:ascii="Lato" w:hAnsi="Lato" w:cs="Lato"/>
+          <w:sz w:val="21"/>
+          <w:szCs w:val="21"/>
+          <w:color w:val="111111"/>
+        </w:rPr>
+        <w:t xml:space="preserve">•</w:t>
+      </w:r>
+      <w:r>
+        <w:rPr>
+          <w:rFonts w:ascii="Lato" w:hAnsi="Lato" w:cs="Lato"/>
+          <w:sz w:val="21"/>
+          <w:szCs w:val="21"/>
+          <w:color w:val="111111"/>
+        </w:rPr>
+        <w:t xml:space="preserve">  </w:t>
+      </w:r>
+      <w:r>
+        <w:rPr>
+          <w:rFonts w:ascii="Lato" w:hAnsi="Lato" w:cs="Lato"/>
+          <w:sz w:val="21"/>
+          <w:szCs w:val="21"/>
+          <w:color w:val="111111"/>
+        </w:rPr>
+        <w:t xml:space="preserve">Trained a MERT-95M reward head to score audio segments across four aesthetic dimensions for candidate selection.</w:t>
       </w:r>
     </w:p>
     <w:p>
@@ -1643,6 +1782,145 @@
           <w:b/>
           <w:color w:val="111111"/>
         </w:rPr>
+        <w:t xml:space="preserve">TECHNICAL SKILLS</w:t>
+      </w:r>
+    </w:p>
+    <w:p>
+      <w:pPr>
+        <w:spacing w:before="0" w:after="10" w:line="248" w:lineRule="exact"/>
+      </w:pPr>
+      <w:r>
+        <w:rPr>
+          <w:rFonts w:ascii="Lato" w:hAnsi="Lato" w:cs="Lato"/>
+          <w:sz w:val="21"/>
+          <w:szCs w:val="21"/>
+          <w:b/>
+          <w:color w:val="111111"/>
+        </w:rPr>
+        <w:t xml:space="preserve">Languages: </w:t>
+      </w:r>
+      <w:r>
+        <w:rPr>
+          <w:rFonts w:ascii="Lato" w:hAnsi="Lato" w:cs="Lato"/>
+          <w:sz w:val="21"/>
+          <w:szCs w:val="21"/>
+          <w:color w:val="111111"/>
+        </w:rPr>
+        <w:t xml:space="preserve">Python, TypeScript, JavaScript, SQL, C#</w:t>
+      </w:r>
+    </w:p>
+    <w:p>
+      <w:pPr>
+        <w:spacing w:before="0" w:after="10" w:line="248" w:lineRule="exact"/>
+      </w:pPr>
+      <w:r>
+        <w:rPr>
+          <w:rFonts w:ascii="Lato" w:hAnsi="Lato" w:cs="Lato"/>
+          <w:sz w:val="21"/>
+          <w:szCs w:val="21"/>
+          <w:b/>
+          <w:color w:val="111111"/>
+        </w:rPr>
+        <w:t xml:space="preserve">AI &amp; LLM: </w:t>
+      </w:r>
+      <w:r>
+        <w:rPr>
+          <w:rFonts w:ascii="Lato" w:hAnsi="Lato" w:cs="Lato"/>
+          <w:sz w:val="21"/>
+          <w:szCs w:val="21"/>
+          <w:color w:val="111111"/>
+        </w:rPr>
+        <w:t xml:space="preserve">AWS Bedrock, LangGraph, RAG, LLM evaluation, Prompt Flow, MCP, PyTorch</w:t>
+      </w:r>
+    </w:p>
+    <w:p>
+      <w:pPr>
+        <w:spacing w:before="0" w:after="10" w:line="248" w:lineRule="exact"/>
+      </w:pPr>
+      <w:r>
+        <w:rPr>
+          <w:rFonts w:ascii="Lato" w:hAnsi="Lato" w:cs="Lato"/>
+          <w:sz w:val="21"/>
+          <w:szCs w:val="21"/>
+          <w:b/>
+          <w:color w:val="111111"/>
+        </w:rPr>
+        <w:t xml:space="preserve">Retrieval &amp; Data: </w:t>
+      </w:r>
+      <w:r>
+        <w:rPr>
+          <w:rFonts w:ascii="Lato" w:hAnsi="Lato" w:cs="Lato"/>
+          <w:sz w:val="21"/>
+          <w:szCs w:val="21"/>
+          <w:color w:val="111111"/>
+        </w:rPr>
+        <w:t xml:space="preserve">PostgreSQL, pgvector, FAISS, Neo4j, Redis, Algolia, Firestore</w:t>
+      </w:r>
+    </w:p>
+    <w:p>
+      <w:pPr>
+        <w:spacing w:before="0" w:after="10" w:line="248" w:lineRule="exact"/>
+      </w:pPr>
+      <w:r>
+        <w:rPr>
+          <w:rFonts w:ascii="Lato" w:hAnsi="Lato" w:cs="Lato"/>
+          <w:sz w:val="21"/>
+          <w:szCs w:val="21"/>
+          <w:b/>
+          <w:color w:val="111111"/>
+        </w:rPr>
+        <w:t xml:space="preserve">Backend &amp; Web: </w:t>
+      </w:r>
+      <w:r>
+        <w:rPr>
+          <w:rFonts w:ascii="Lato" w:hAnsi="Lato" w:cs="Lato"/>
+          <w:sz w:val="21"/>
+          <w:szCs w:val="21"/>
+          <w:color w:val="111111"/>
+        </w:rPr>
+        <w:t xml:space="preserve">FastAPI, NestJS, Node.js, .NET, React, Nuxt</w:t>
+      </w:r>
+    </w:p>
+    <w:p>
+      <w:pPr>
+        <w:spacing w:before="0" w:after="10" w:line="248" w:lineRule="exact"/>
+      </w:pPr>
+      <w:r>
+        <w:rPr>
+          <w:rFonts w:ascii="Lato" w:hAnsi="Lato" w:cs="Lato"/>
+          <w:sz w:val="21"/>
+          <w:szCs w:val="21"/>
+          <w:b/>
+          <w:color w:val="111111"/>
+        </w:rPr>
+        <w:t xml:space="preserve">Cloud &amp; Quality: </w:t>
+      </w:r>
+      <w:r>
+        <w:rPr>
+          <w:rFonts w:ascii="Lato" w:hAnsi="Lato" w:cs="Lato"/>
+          <w:sz w:val="21"/>
+          <w:szCs w:val="21"/>
+          <w:color w:val="111111"/>
+        </w:rPr>
+        <w:t xml:space="preserve">AWS (Step Functions, Lambda, S3, CDK), GCP Cloud Run, Docker, Kubernetes, CI/CD, pytest</w:t>
+      </w:r>
+    </w:p>
+    <w:p>
+      <w:pPr>
+        <w:keepNext/>
+        <w:pBdr>
+          <w:bottom w:val="single" w:sz="4" w:space="1" w:color="999999"/>
+        </w:pBdr>
+        <w:spacing w:before="120" w:after="40" w:line="240" w:lineRule="auto"/>
+      </w:pPr>
+      <w:r>
+        <w:rPr>
+          <w:rFonts w:ascii="Lato" w:hAnsi="Lato" w:cs="Lato"/>
+          <w:sz w:val="22"/>
+          <w:szCs w:val="22"/>
+          <w:b/>
+          <w:color w:val="111111"/>
+        </w:rPr>
         <w:t xml:space="preserve">EDUCATION</w:t>
       </w:r>
     </w:p>
@@ -1706,7 +1984,7 @@
           <w:i/>
           <w:color w:val="111111"/>
         </w:rPr>
-        <w:t xml:space="preserve">Tempe, AZ, USA</w:t>
+        <w:t xml:space="preserve">Tempe, AZ</w:t>
       </w:r>
     </w:p>
     <w:p>
@@ -1769,7 +2047,7 @@
           <w:i/>
           <w:color w:val="111111"/>
         </w:rPr>
-        <w:t xml:space="preserve">India</w:t>
+        <w:t xml:space="preserve">Gandhinagar, India</w:t>
       </w:r>
     </w:p>
     <w:sectPr>

</xml_diff>

<commit_message>
Lead the AI resume with agents, evals, traceability and RAG
New bullets for both EdPlus roles and MyStage cover LLM-as-judge and
code-scored evals, Logfire/OpenTelemetry tracing, per-row traceability,
guardrails, prompt caching, hybrid retrieval and GraphRAG. The web app,
Algolia search and ingestion bullets drop from the AI picks. The AI
skills lines now list current AI engineering terms. Other resumes are
unchanged.
</commit_message>
<xml_diff>
--- a/public/Archit_Agrawal_AI_Software_Engineer_Resume.docx
+++ b/public/Archit_Agrawal_AI_Software_Engineer_Resume.docx
@@ -239,106 +239,205 @@
           <w:szCs w:val="21"/>
           <w:color w:val="111111"/>
         </w:rPr>
-        <w:t xml:space="preserve">Own architecture and delivery of an AI analytics platform on AWS Bedrock and Step Functions that turns any structured dataset into cited, code-computed answers.</w:t>
-      </w:r>
-    </w:p>
-    <w:p>
-      <w:pPr>
-        <w:spacing w:before="0" w:after="10" w:line="248" w:lineRule="exact"/>
-        <w:ind w:left="200" w:hanging="200"/>
-      </w:pPr>
-      <w:r>
-        <w:rPr>
-          <w:rFonts w:ascii="Lato" w:hAnsi="Lato" w:cs="Lato"/>
-          <w:sz w:val="21"/>
-          <w:szCs w:val="21"/>
-          <w:color w:val="111111"/>
-        </w:rPr>
-        <w:t xml:space="preserve">•</w:t>
-      </w:r>
-      <w:r>
-        <w:rPr>
-          <w:rFonts w:ascii="Lato" w:hAnsi="Lato" w:cs="Lato"/>
-          <w:sz w:val="21"/>
-          <w:szCs w:val="21"/>
-          <w:color w:val="111111"/>
-        </w:rPr>
-        <w:t xml:space="preserve">  </w:t>
-      </w:r>
-      <w:r>
-        <w:rPr>
-          <w:rFonts w:ascii="Lato" w:hAnsi="Lato" w:cs="Lato"/>
-          <w:sz w:val="21"/>
-          <w:szCs w:val="21"/>
-          <w:color w:val="111111"/>
-        </w:rPr>
-        <w:t xml:space="preserve">Built the platform's web application with a Nuxt frontend and NestJS backend, sharing TypeScript contracts across 70 API routes.</w:t>
-      </w:r>
-    </w:p>
-    <w:p>
-      <w:pPr>
-        <w:spacing w:before="0" w:after="10" w:line="248" w:lineRule="exact"/>
-        <w:ind w:left="200" w:hanging="200"/>
-      </w:pPr>
-      <w:r>
-        <w:rPr>
-          <w:rFonts w:ascii="Lato" w:hAnsi="Lato" w:cs="Lato"/>
-          <w:sz w:val="21"/>
-          <w:szCs w:val="21"/>
-          <w:color w:val="111111"/>
-        </w:rPr>
-        <w:t xml:space="preserve">•</w:t>
-      </w:r>
-      <w:r>
-        <w:rPr>
-          <w:rFonts w:ascii="Lato" w:hAnsi="Lato" w:cs="Lato"/>
-          <w:sz w:val="21"/>
-          <w:szCs w:val="21"/>
-          <w:color w:val="111111"/>
-        </w:rPr>
-        <w:t xml:space="preserve">  </w:t>
-      </w:r>
-      <w:r>
-        <w:rPr>
-          <w:rFonts w:ascii="Lato" w:hAnsi="Lato" w:cs="Lato"/>
-          <w:sz w:val="21"/>
-          <w:szCs w:val="21"/>
-          <w:color w:val="111111"/>
-        </w:rPr>
-        <w:t xml:space="preserve">Reduced AWS pipeline runtime from 500 to 85 seconds by replacing two managed-agent stages with direct tool calls.</w:t>
-      </w:r>
-    </w:p>
-    <w:p>
-      <w:pPr>
-        <w:spacing w:before="0" w:after="10" w:line="248" w:lineRule="exact"/>
-        <w:ind w:left="200" w:hanging="200"/>
-      </w:pPr>
-      <w:r>
-        <w:rPr>
-          <w:rFonts w:ascii="Lato" w:hAnsi="Lato" w:cs="Lato"/>
-          <w:sz w:val="21"/>
-          <w:szCs w:val="21"/>
-          <w:color w:val="111111"/>
-        </w:rPr>
-        <w:t xml:space="preserve">•</w:t>
-      </w:r>
-      <w:r>
-        <w:rPr>
-          <w:rFonts w:ascii="Lato" w:hAnsi="Lato" w:cs="Lato"/>
-          <w:sz w:val="21"/>
-          <w:szCs w:val="21"/>
-          <w:color w:val="111111"/>
-        </w:rPr>
-        <w:t xml:space="preserve">  </w:t>
-      </w:r>
-      <w:r>
-        <w:rPr>
-          <w:rFonts w:ascii="Lato" w:hAnsi="Lato" w:cs="Lato"/>
-          <w:sz w:val="21"/>
-          <w:szCs w:val="21"/>
-          <w:color w:val="111111"/>
-        </w:rPr>
-        <w:t xml:space="preserve">Cut incorrect answers 85% in an evaluation against 164 published benchmark figures by adding answer verification before display.</w:t>
+        <w:t xml:space="preserve">Own a multi-agent LLM platform end to end on AWS Bedrock and Step Functions: 12 tool-calling agents over 76 tools answer questions on any structured dataset, each answer cited to its source rows.</w:t>
+      </w:r>
+    </w:p>
+    <w:p>
+      <w:pPr>
+        <w:spacing w:before="0" w:after="10" w:line="248" w:lineRule="exact"/>
+        <w:ind w:left="200" w:hanging="200"/>
+      </w:pPr>
+      <w:r>
+        <w:rPr>
+          <w:rFonts w:ascii="Lato" w:hAnsi="Lato" w:cs="Lato"/>
+          <w:sz w:val="21"/>
+          <w:szCs w:val="21"/>
+          <w:color w:val="111111"/>
+        </w:rPr>
+        <w:t xml:space="preserve">•</w:t>
+      </w:r>
+      <w:r>
+        <w:rPr>
+          <w:rFonts w:ascii="Lato" w:hAnsi="Lato" w:cs="Lato"/>
+          <w:sz w:val="21"/>
+          <w:szCs w:val="21"/>
+          <w:color w:val="111111"/>
+        </w:rPr>
+        <w:t xml:space="preserve">  </w:t>
+      </w:r>
+      <w:r>
+        <w:rPr>
+          <w:rFonts w:ascii="Lato" w:hAnsi="Lato" w:cs="Lato"/>
+          <w:sz w:val="21"/>
+          <w:szCs w:val="21"/>
+          <w:color w:val="111111"/>
+        </w:rPr>
+        <w:t xml:space="preserve">Built the LLM eval harness: code-scored benchmarks and LLM-as-judge rubrics gate every agent and prompt change; answer verification cut hallucinated figures 85% across 164 published results.</w:t>
+      </w:r>
+    </w:p>
+    <w:p>
+      <w:pPr>
+        <w:spacing w:before="0" w:after="10" w:line="248" w:lineRule="exact"/>
+        <w:ind w:left="200" w:hanging="200"/>
+      </w:pPr>
+      <w:r>
+        <w:rPr>
+          <w:rFonts w:ascii="Lato" w:hAnsi="Lato" w:cs="Lato"/>
+          <w:sz w:val="21"/>
+          <w:szCs w:val="21"/>
+          <w:color w:val="111111"/>
+        </w:rPr>
+        <w:t xml:space="preserve">•</w:t>
+      </w:r>
+      <w:r>
+        <w:rPr>
+          <w:rFonts w:ascii="Lato" w:hAnsi="Lato" w:cs="Lato"/>
+          <w:sz w:val="21"/>
+          <w:szCs w:val="21"/>
+          <w:color w:val="111111"/>
+        </w:rPr>
+        <w:t xml:space="preserve">  </w:t>
+      </w:r>
+      <w:r>
+        <w:rPr>
+          <w:rFonts w:ascii="Lato" w:hAnsi="Lato" w:cs="Lato"/>
+          <w:sz w:val="21"/>
+          <w:szCs w:val="21"/>
+          <w:color w:val="111111"/>
+        </w:rPr>
+        <w:t xml:space="preserve">Built traceability into every LLM run: per-row correlation IDs, versioned outputs and corrections, lineage and replayable runs; structured outputs reached 100% join integrity where 1 in 8 rows used to be mislabeled.</w:t>
+      </w:r>
+    </w:p>
+    <w:p>
+      <w:pPr>
+        <w:spacing w:before="0" w:after="10" w:line="248" w:lineRule="exact"/>
+        <w:ind w:left="200" w:hanging="200"/>
+      </w:pPr>
+      <w:r>
+        <w:rPr>
+          <w:rFonts w:ascii="Lato" w:hAnsi="Lato" w:cs="Lato"/>
+          <w:sz w:val="21"/>
+          <w:szCs w:val="21"/>
+          <w:color w:val="111111"/>
+        </w:rPr>
+        <w:t xml:space="preserve">•</w:t>
+      </w:r>
+      <w:r>
+        <w:rPr>
+          <w:rFonts w:ascii="Lato" w:hAnsi="Lato" w:cs="Lato"/>
+          <w:sz w:val="21"/>
+          <w:szCs w:val="21"/>
+          <w:color w:val="111111"/>
+        </w:rPr>
+        <w:t xml:space="preserve">  </w:t>
+      </w:r>
+      <w:r>
+        <w:rPr>
+          <w:rFonts w:ascii="Lato" w:hAnsi="Lato" w:cs="Lato"/>
+          <w:sz w:val="21"/>
+          <w:szCs w:val="21"/>
+          <w:color w:val="111111"/>
+        </w:rPr>
+        <w:t xml:space="preserve">Cut pipeline latency from 500 to 85 seconds with direct tool calls and held a 19-call run to $0.03 with Bedrock prompt caching, bounding failures and spend with a 5% circuit breaker and per-stage caps.</w:t>
+      </w:r>
+    </w:p>
+    <w:p>
+      <w:pPr>
+        <w:spacing w:before="0" w:after="10" w:line="248" w:lineRule="exact"/>
+        <w:ind w:left="200" w:hanging="200"/>
+      </w:pPr>
+      <w:r>
+        <w:rPr>
+          <w:rFonts w:ascii="Lato" w:hAnsi="Lato" w:cs="Lato"/>
+          <w:sz w:val="21"/>
+          <w:szCs w:val="21"/>
+          <w:color w:val="111111"/>
+        </w:rPr>
+        <w:t xml:space="preserve">•</w:t>
+      </w:r>
+      <w:r>
+        <w:rPr>
+          <w:rFonts w:ascii="Lato" w:hAnsi="Lato" w:cs="Lato"/>
+          <w:sz w:val="21"/>
+          <w:szCs w:val="21"/>
+          <w:color w:val="111111"/>
+        </w:rPr>
+        <w:t xml:space="preserve">  </w:t>
+      </w:r>
+      <w:r>
+        <w:rPr>
+          <w:rFonts w:ascii="Lato" w:hAnsi="Lato" w:cs="Lato"/>
+          <w:sz w:val="21"/>
+          <w:szCs w:val="21"/>
+          <w:color w:val="111111"/>
+        </w:rPr>
+        <w:t xml:space="preserve">Raised accuracy from 60% to 93% on the hardest benchmark questions through context engineering: a shared semantic layer compiles questions into query plans behind 7 validation checks.</w:t>
+      </w:r>
+    </w:p>
+    <w:p>
+      <w:pPr>
+        <w:spacing w:before="0" w:after="10" w:line="248" w:lineRule="exact"/>
+        <w:ind w:left="200" w:hanging="200"/>
+      </w:pPr>
+      <w:r>
+        <w:rPr>
+          <w:rFonts w:ascii="Lato" w:hAnsi="Lato" w:cs="Lato"/>
+          <w:sz w:val="21"/>
+          <w:szCs w:val="21"/>
+          <w:color w:val="111111"/>
+        </w:rPr>
+        <w:t xml:space="preserve">•</w:t>
+      </w:r>
+      <w:r>
+        <w:rPr>
+          <w:rFonts w:ascii="Lato" w:hAnsi="Lato" w:cs="Lato"/>
+          <w:sz w:val="21"/>
+          <w:szCs w:val="21"/>
+          <w:color w:val="111111"/>
+        </w:rPr>
+        <w:t xml:space="preserve">  </w:t>
+      </w:r>
+      <w:r>
+        <w:rPr>
+          <w:rFonts w:ascii="Lato" w:hAnsi="Lato" w:cs="Lato"/>
+          <w:sz w:val="21"/>
+          <w:szCs w:val="21"/>
+          <w:color w:val="111111"/>
+        </w:rPr>
+        <w:t xml:space="preserve">Built hybrid retrieval over S3, Lance vector search plus BM25 through DuckDB, behind entitlement-gated row-level access and Bedrock Guardrails deployed through AWS CDK.</w:t>
+      </w:r>
+    </w:p>
+    <w:p>
+      <w:pPr>
+        <w:spacing w:before="0" w:after="10" w:line="248" w:lineRule="exact"/>
+        <w:ind w:left="200" w:hanging="200"/>
+      </w:pPr>
+      <w:r>
+        <w:rPr>
+          <w:rFonts w:ascii="Lato" w:hAnsi="Lato" w:cs="Lato"/>
+          <w:sz w:val="21"/>
+          <w:szCs w:val="21"/>
+          <w:color w:val="111111"/>
+        </w:rPr>
+        <w:t xml:space="preserve">•</w:t>
+      </w:r>
+      <w:r>
+        <w:rPr>
+          <w:rFonts w:ascii="Lato" w:hAnsi="Lato" w:cs="Lato"/>
+          <w:sz w:val="21"/>
+          <w:szCs w:val="21"/>
+          <w:color w:val="111111"/>
+        </w:rPr>
+        <w:t xml:space="preserve">  </w:t>
+      </w:r>
+      <w:r>
+        <w:rPr>
+          <w:rFonts w:ascii="Lato" w:hAnsi="Lato" w:cs="Lato"/>
+          <w:sz w:val="21"/>
+          <w:szCs w:val="21"/>
+          <w:color w:val="111111"/>
+        </w:rPr>
+        <w:t xml:space="preserve">Traced silent row loss in Step Functions runs that reported success and fixed it with partitioned writes and fan-in across 64 parallel lanes.</w:t>
       </w:r>
     </w:p>
     <w:p>
@@ -404,39 +503,6 @@
           <w:szCs w:val="21"/>
           <w:color w:val="111111"/>
         </w:rPr>
-        <w:t xml:space="preserve">Improved accuracy from 60% to 93% on the hardest benchmark questions by consolidating column definitions in a shared semantic layer.</w:t>
-      </w:r>
-    </w:p>
-    <w:p>
-      <w:pPr>
-        <w:spacing w:before="0" w:after="10" w:line="248" w:lineRule="exact"/>
-        <w:ind w:left="200" w:hanging="200"/>
-      </w:pPr>
-      <w:r>
-        <w:rPr>
-          <w:rFonts w:ascii="Lato" w:hAnsi="Lato" w:cs="Lato"/>
-          <w:sz w:val="21"/>
-          <w:szCs w:val="21"/>
-          <w:color w:val="111111"/>
-        </w:rPr>
-        <w:t xml:space="preserve">•</w:t>
-      </w:r>
-      <w:r>
-        <w:rPr>
-          <w:rFonts w:ascii="Lato" w:hAnsi="Lato" w:cs="Lato"/>
-          <w:sz w:val="21"/>
-          <w:szCs w:val="21"/>
-          <w:color w:val="111111"/>
-        </w:rPr>
-        <w:t xml:space="preserve">  </w:t>
-      </w:r>
-      <w:r>
-        <w:rPr>
-          <w:rFonts w:ascii="Lato" w:hAnsi="Lato" w:cs="Lato"/>
-          <w:sz w:val="21"/>
-          <w:szCs w:val="21"/>
-          <w:color w:val="111111"/>
-        </w:rPr>
         <w:t xml:space="preserve">Quadrupled the headline findings automated reports recover, 13% to 52–59% on held-out datasets, by letting an LLM choose analyses while code computes every number.</w:t>
       </w:r>
     </w:p>
@@ -470,40 +536,40 @@
           <w:szCs w:val="21"/>
           <w:color w:val="111111"/>
         </w:rPr>
-        <w:t xml:space="preserve">Reached 100% join integrity on repeat runs with schema-constrained LLM output and per-row IDs; the prior pipeline silently mislabeled 1 in 8 rows.</w:t>
-      </w:r>
-    </w:p>
-    <w:p>
-      <w:pPr>
-        <w:spacing w:before="0" w:after="10" w:line="248" w:lineRule="exact"/>
-        <w:ind w:left="200" w:hanging="200"/>
-      </w:pPr>
-      <w:r>
-        <w:rPr>
-          <w:rFonts w:ascii="Lato" w:hAnsi="Lato" w:cs="Lato"/>
-          <w:sz w:val="21"/>
-          <w:szCs w:val="21"/>
-          <w:color w:val="111111"/>
-        </w:rPr>
-        <w:t xml:space="preserve">•</w:t>
-      </w:r>
-      <w:r>
-        <w:rPr>
-          <w:rFonts w:ascii="Lato" w:hAnsi="Lato" w:cs="Lato"/>
-          <w:sz w:val="21"/>
-          <w:szCs w:val="21"/>
-          <w:color w:val="111111"/>
-        </w:rPr>
-        <w:t xml:space="preserve">  </w:t>
-      </w:r>
-      <w:r>
-        <w:rPr>
-          <w:rFonts w:ascii="Lato" w:hAnsi="Lato" w:cs="Lato"/>
-          <w:sz w:val="21"/>
-          <w:szCs w:val="21"/>
-          <w:color w:val="111111"/>
-        </w:rPr>
         <w:t xml:space="preserve">Showed model choice moves labeling F1 33x more than pipeline design (0.230 vs 0.007), redirecting the team toward reliability.</w:t>
+      </w:r>
+    </w:p>
+    <w:p>
+      <w:pPr>
+        <w:spacing w:before="0" w:after="10" w:line="248" w:lineRule="exact"/>
+        <w:ind w:left="200" w:hanging="200"/>
+      </w:pPr>
+      <w:r>
+        <w:rPr>
+          <w:rFonts w:ascii="Lato" w:hAnsi="Lato" w:cs="Lato"/>
+          <w:sz w:val="21"/>
+          <w:szCs w:val="21"/>
+          <w:color w:val="111111"/>
+        </w:rPr>
+        <w:t xml:space="preserve">•</w:t>
+      </w:r>
+      <w:r>
+        <w:rPr>
+          <w:rFonts w:ascii="Lato" w:hAnsi="Lato" w:cs="Lato"/>
+          <w:sz w:val="21"/>
+          <w:szCs w:val="21"/>
+          <w:color w:val="111111"/>
+        </w:rPr>
+        <w:t xml:space="preserve">  </w:t>
+      </w:r>
+      <w:r>
+        <w:rPr>
+          <w:rFonts w:ascii="Lato" w:hAnsi="Lato" w:cs="Lato"/>
+          <w:sz w:val="21"/>
+          <w:szCs w:val="21"/>
+          <w:color w:val="111111"/>
+        </w:rPr>
+        <w:t xml:space="preserve">Reduced publishing time from 19 minutes to 109 seconds for a 51,280-respondent survey; an independent raw-data audit matched all evaluated figures.</w:t>
       </w:r>
     </w:p>
     <w:p>
@@ -600,139 +666,139 @@
           <w:szCs w:val="21"/>
           <w:color w:val="111111"/>
         </w:rPr>
-        <w:t xml:space="preserve">Consolidated a 14-Cloud-Function backend into a checkpointed Python/LangGraph workflow on GCP Cloud Run, reducing production service dependencies 64%.</w:t>
-      </w:r>
-    </w:p>
-    <w:p>
-      <w:pPr>
-        <w:spacing w:before="0" w:after="10" w:line="248" w:lineRule="exact"/>
-        <w:ind w:left="200" w:hanging="200"/>
-      </w:pPr>
-      <w:r>
-        <w:rPr>
-          <w:rFonts w:ascii="Lato" w:hAnsi="Lato" w:cs="Lato"/>
-          <w:sz w:val="21"/>
-          <w:szCs w:val="21"/>
-          <w:color w:val="111111"/>
-        </w:rPr>
-        <w:t xml:space="preserve">•</w:t>
-      </w:r>
-      <w:r>
-        <w:rPr>
-          <w:rFonts w:ascii="Lato" w:hAnsi="Lato" w:cs="Lato"/>
-          <w:sz w:val="21"/>
-          <w:szCs w:val="21"/>
-          <w:color w:val="111111"/>
-        </w:rPr>
-        <w:t xml:space="preserve">  </w:t>
-      </w:r>
-      <w:r>
-        <w:rPr>
-          <w:rFonts w:ascii="Lato" w:hAnsi="Lato" w:cs="Lato"/>
-          <w:sz w:val="21"/>
-          <w:szCs w:val="21"/>
-          <w:color w:val="111111"/>
-        </w:rPr>
-        <w:t xml:space="preserve">Built FastAPI and Algolia search with sub-50 ms latency, real-time Firestore synchronization, 200+ pytest tests and Logfire tracing.</w:t>
-      </w:r>
-    </w:p>
-    <w:p>
-      <w:pPr>
-        <w:spacing w:before="0" w:after="10" w:line="248" w:lineRule="exact"/>
-        <w:ind w:left="200" w:hanging="200"/>
-      </w:pPr>
-      <w:r>
-        <w:rPr>
-          <w:rFonts w:ascii="Lato" w:hAnsi="Lato" w:cs="Lato"/>
-          <w:sz w:val="21"/>
-          <w:szCs w:val="21"/>
-          <w:color w:val="111111"/>
-        </w:rPr>
-        <w:t xml:space="preserve">•</w:t>
-      </w:r>
-      <w:r>
-        <w:rPr>
-          <w:rFonts w:ascii="Lato" w:hAnsi="Lato" w:cs="Lato"/>
-          <w:sz w:val="21"/>
-          <w:szCs w:val="21"/>
-          <w:color w:val="111111"/>
-        </w:rPr>
-        <w:t xml:space="preserve">  </w:t>
-      </w:r>
-      <w:r>
-        <w:rPr>
-          <w:rFonts w:ascii="Lato" w:hAnsi="Lato" w:cs="Lato"/>
-          <w:sz w:val="21"/>
-          <w:szCs w:val="21"/>
-          <w:color w:val="111111"/>
-        </w:rPr>
-        <w:t xml:space="preserve">Scaled ingestion to 70,000+ records daily from 650+ venues using Playwright, transactional locking and entity resolution.</w:t>
-      </w:r>
-    </w:p>
-    <w:p>
-      <w:pPr>
-        <w:spacing w:before="0" w:after="10" w:line="248" w:lineRule="exact"/>
-        <w:ind w:left="200" w:hanging="200"/>
-      </w:pPr>
-      <w:r>
-        <w:rPr>
-          <w:rFonts w:ascii="Lato" w:hAnsi="Lato" w:cs="Lato"/>
-          <w:sz w:val="21"/>
-          <w:szCs w:val="21"/>
-          <w:color w:val="111111"/>
-        </w:rPr>
-        <w:t xml:space="preserve">•</w:t>
-      </w:r>
-      <w:r>
-        <w:rPr>
-          <w:rFonts w:ascii="Lato" w:hAnsi="Lato" w:cs="Lato"/>
-          <w:sz w:val="21"/>
-          <w:szCs w:val="21"/>
-          <w:color w:val="111111"/>
-        </w:rPr>
-        <w:t xml:space="preserve">  </w:t>
-      </w:r>
-      <w:r>
-        <w:rPr>
-          <w:rFonts w:ascii="Lato" w:hAnsi="Lato" w:cs="Lato"/>
-          <w:sz w:val="21"/>
-          <w:szCs w:val="21"/>
-          <w:color w:val="111111"/>
-        </w:rPr>
-        <w:t xml:space="preserve">Implemented checkpointed pause-and-resume so records missing context wait for additional information without failing the ingestion batch.</w:t>
-      </w:r>
-    </w:p>
-    <w:p>
-      <w:pPr>
-        <w:spacing w:before="0" w:after="10" w:line="248" w:lineRule="exact"/>
-        <w:ind w:left="200" w:hanging="200"/>
-      </w:pPr>
-      <w:r>
-        <w:rPr>
-          <w:rFonts w:ascii="Lato" w:hAnsi="Lato" w:cs="Lato"/>
-          <w:sz w:val="21"/>
-          <w:szCs w:val="21"/>
-          <w:color w:val="111111"/>
-        </w:rPr>
-        <w:t xml:space="preserve">•</w:t>
-      </w:r>
-      <w:r>
-        <w:rPr>
-          <w:rFonts w:ascii="Lato" w:hAnsi="Lato" w:cs="Lato"/>
-          <w:sz w:val="21"/>
-          <w:szCs w:val="21"/>
-          <w:color w:val="111111"/>
-        </w:rPr>
-        <w:t xml:space="preserve">  </w:t>
-      </w:r>
-      <w:r>
-        <w:rPr>
-          <w:rFonts w:ascii="Lato" w:hAnsi="Lato" w:cs="Lato"/>
-          <w:sz w:val="21"/>
-          <w:szCs w:val="21"/>
-          <w:color w:val="111111"/>
-        </w:rPr>
-        <w:t xml:space="preserve">Made ingestion retries safe with deterministic task IDs and atomic create-if-absent writes, preventing duplicate jobs from overwriting in-flight work.</w:t>
+        <w:t xml:space="preserve">Rebuilt a 14-Cloud-Function backend as one durable LangGraph agent workflow on GCP Cloud Run, with checkpointing and human-in-the-loop interrupt and resume, cutting service dependencies 64%.</w:t>
+      </w:r>
+    </w:p>
+    <w:p>
+      <w:pPr>
+        <w:spacing w:before="0" w:after="10" w:line="248" w:lineRule="exact"/>
+        <w:ind w:left="200" w:hanging="200"/>
+      </w:pPr>
+      <w:r>
+        <w:rPr>
+          <w:rFonts w:ascii="Lato" w:hAnsi="Lato" w:cs="Lato"/>
+          <w:sz w:val="21"/>
+          <w:szCs w:val="21"/>
+          <w:color w:val="111111"/>
+        </w:rPr>
+        <w:t xml:space="preserve">•</w:t>
+      </w:r>
+      <w:r>
+        <w:rPr>
+          <w:rFonts w:ascii="Lato" w:hAnsi="Lato" w:cs="Lato"/>
+          <w:sz w:val="21"/>
+          <w:szCs w:val="21"/>
+          <w:color w:val="111111"/>
+        </w:rPr>
+        <w:t xml:space="preserve">  </w:t>
+      </w:r>
+      <w:r>
+        <w:rPr>
+          <w:rFonts w:ascii="Lato" w:hAnsi="Lato" w:cs="Lato"/>
+          <w:sz w:val="21"/>
+          <w:szCs w:val="21"/>
+          <w:color w:val="111111"/>
+        </w:rPr>
+        <w:t xml:space="preserve">Instrumented LLM observability via Logfire (OpenTelemetry), tracing each run across pause and resume.</w:t>
+      </w:r>
+    </w:p>
+    <w:p>
+      <w:pPr>
+        <w:spacing w:before="0" w:after="10" w:line="248" w:lineRule="exact"/>
+        <w:ind w:left="200" w:hanging="200"/>
+      </w:pPr>
+      <w:r>
+        <w:rPr>
+          <w:rFonts w:ascii="Lato" w:hAnsi="Lato" w:cs="Lato"/>
+          <w:sz w:val="21"/>
+          <w:szCs w:val="21"/>
+          <w:color w:val="111111"/>
+        </w:rPr>
+        <w:t xml:space="preserve">•</w:t>
+      </w:r>
+      <w:r>
+        <w:rPr>
+          <w:rFonts w:ascii="Lato" w:hAnsi="Lato" w:cs="Lato"/>
+          <w:sz w:val="21"/>
+          <w:szCs w:val="21"/>
+          <w:color w:val="111111"/>
+        </w:rPr>
+        <w:t xml:space="preserve">  </w:t>
+      </w:r>
+      <w:r>
+        <w:rPr>
+          <w:rFonts w:ascii="Lato" w:hAnsi="Lato" w:cs="Lato"/>
+          <w:sz w:val="21"/>
+          <w:szCs w:val="21"/>
+          <w:color w:val="111111"/>
+        </w:rPr>
+        <w:t xml:space="preserve">Lifted dataset accuracy 25% with Gemini entity resolution, scored by LLM-as-judge, over 70,000+ records a day.</w:t>
+      </w:r>
+    </w:p>
+    <w:p>
+      <w:pPr>
+        <w:spacing w:before="0" w:after="10" w:line="248" w:lineRule="exact"/>
+        <w:ind w:left="200" w:hanging="200"/>
+      </w:pPr>
+      <w:r>
+        <w:rPr>
+          <w:rFonts w:ascii="Lato" w:hAnsi="Lato" w:cs="Lato"/>
+          <w:sz w:val="21"/>
+          <w:szCs w:val="21"/>
+          <w:color w:val="111111"/>
+        </w:rPr>
+        <w:t xml:space="preserve">•</w:t>
+      </w:r>
+      <w:r>
+        <w:rPr>
+          <w:rFonts w:ascii="Lato" w:hAnsi="Lato" w:cs="Lato"/>
+          <w:sz w:val="21"/>
+          <w:szCs w:val="21"/>
+          <w:color w:val="111111"/>
+        </w:rPr>
+        <w:t xml:space="preserve">  </w:t>
+      </w:r>
+      <w:r>
+        <w:rPr>
+          <w:rFonts w:ascii="Lato" w:hAnsi="Lato" w:cs="Lato"/>
+          <w:sz w:val="21"/>
+          <w:szCs w:val="21"/>
+          <w:color w:val="111111"/>
+        </w:rPr>
+        <w:t xml:space="preserve">Made the pipeline fault tolerant with deterministic task IDs, atomic Firestore claims, per-branch error isolation across parallel fan-out and 200+ pytest tests.</w:t>
+      </w:r>
+    </w:p>
+    <w:p>
+      <w:pPr>
+        <w:spacing w:before="0" w:after="10" w:line="248" w:lineRule="exact"/>
+        <w:ind w:left="200" w:hanging="200"/>
+      </w:pPr>
+      <w:r>
+        <w:rPr>
+          <w:rFonts w:ascii="Lato" w:hAnsi="Lato" w:cs="Lato"/>
+          <w:sz w:val="21"/>
+          <w:szCs w:val="21"/>
+          <w:color w:val="111111"/>
+        </w:rPr>
+        <w:t xml:space="preserve">•</w:t>
+      </w:r>
+      <w:r>
+        <w:rPr>
+          <w:rFonts w:ascii="Lato" w:hAnsi="Lato" w:cs="Lato"/>
+          <w:sz w:val="21"/>
+          <w:szCs w:val="21"/>
+          <w:color w:val="111111"/>
+        </w:rPr>
+        <w:t xml:space="preserve">  </w:t>
+      </w:r>
+      <w:r>
+        <w:rPr>
+          <w:rFonts w:ascii="Lato" w:hAnsi="Lato" w:cs="Lato"/>
+          <w:sz w:val="21"/>
+          <w:szCs w:val="21"/>
+          <w:color w:val="111111"/>
+        </w:rPr>
+        <w:t xml:space="preserve">Delivered sub-50 ms venue search through FastAPI and Algolia, synchronizing Firestore updates into the search index in real time.</w:t>
       </w:r>
     </w:p>
     <w:p>
@@ -829,139 +895,139 @@
           <w:szCs w:val="21"/>
           <w:color w:val="111111"/>
         </w:rPr>
-        <w:t xml:space="preserve">Built a multi-tenant course assistant from React UI to retrieval services, used by 1,000+ faculty creating courses for 60,000+ students.</w:t>
-      </w:r>
-    </w:p>
-    <w:p>
-      <w:pPr>
-        <w:spacing w:before="0" w:after="10" w:line="248" w:lineRule="exact"/>
-        <w:ind w:left="200" w:hanging="200"/>
-      </w:pPr>
-      <w:r>
-        <w:rPr>
-          <w:rFonts w:ascii="Lato" w:hAnsi="Lato" w:cs="Lato"/>
-          <w:sz w:val="21"/>
-          <w:szCs w:val="21"/>
-          <w:color w:val="111111"/>
-        </w:rPr>
-        <w:t xml:space="preserve">•</w:t>
-      </w:r>
-      <w:r>
-        <w:rPr>
-          <w:rFonts w:ascii="Lato" w:hAnsi="Lato" w:cs="Lato"/>
-          <w:sz w:val="21"/>
-          <w:szCs w:val="21"/>
-          <w:color w:val="111111"/>
-        </w:rPr>
-        <w:t xml:space="preserve">  </w:t>
-      </w:r>
-      <w:r>
-        <w:rPr>
-          <w:rFonts w:ascii="Lato" w:hAnsi="Lato" w:cs="Lato"/>
-          <w:sz w:val="21"/>
-          <w:szCs w:val="21"/>
-          <w:color w:val="111111"/>
-        </w:rPr>
-        <w:t xml:space="preserve">Established Prompt Flow release checks for groundedness, relevance and coherence, evaluating prompt changes against measured results before deployment.</w:t>
-      </w:r>
-    </w:p>
-    <w:p>
-      <w:pPr>
-        <w:spacing w:before="0" w:after="10" w:line="248" w:lineRule="exact"/>
-        <w:ind w:left="200" w:hanging="200"/>
-      </w:pPr>
-      <w:r>
-        <w:rPr>
-          <w:rFonts w:ascii="Lato" w:hAnsi="Lato" w:cs="Lato"/>
-          <w:sz w:val="21"/>
-          <w:szCs w:val="21"/>
-          <w:color w:val="111111"/>
-        </w:rPr>
-        <w:t xml:space="preserve">•</w:t>
-      </w:r>
-      <w:r>
-        <w:rPr>
-          <w:rFonts w:ascii="Lato" w:hAnsi="Lato" w:cs="Lato"/>
-          <w:sz w:val="21"/>
-          <w:szCs w:val="21"/>
-          <w:color w:val="111111"/>
-        </w:rPr>
-        <w:t xml:space="preserve">  </w:t>
-      </w:r>
-      <w:r>
-        <w:rPr>
-          <w:rFonts w:ascii="Lato" w:hAnsi="Lato" w:cs="Lato"/>
-          <w:sz w:val="21"/>
-          <w:szCs w:val="21"/>
-          <w:color w:val="111111"/>
-        </w:rPr>
-        <w:t xml:space="preserve">Implemented tenant isolation in retrieval services and configuration-based onboarding for additional colleges.</w:t>
-      </w:r>
-    </w:p>
-    <w:p>
-      <w:pPr>
-        <w:spacing w:before="0" w:after="10" w:line="248" w:lineRule="exact"/>
-        <w:ind w:left="200" w:hanging="200"/>
-      </w:pPr>
-      <w:r>
-        <w:rPr>
-          <w:rFonts w:ascii="Lato" w:hAnsi="Lato" w:cs="Lato"/>
-          <w:sz w:val="21"/>
-          <w:szCs w:val="21"/>
-          <w:color w:val="111111"/>
-        </w:rPr>
-        <w:t xml:space="preserve">•</w:t>
-      </w:r>
-      <w:r>
-        <w:rPr>
-          <w:rFonts w:ascii="Lato" w:hAnsi="Lato" w:cs="Lato"/>
-          <w:sz w:val="21"/>
-          <w:szCs w:val="21"/>
-          <w:color w:val="111111"/>
-        </w:rPr>
-        <w:t xml:space="preserve">  </w:t>
-      </w:r>
-      <w:r>
-        <w:rPr>
-          <w:rFonts w:ascii="Lato" w:hAnsi="Lato" w:cs="Lato"/>
-          <w:sz w:val="21"/>
-          <w:szCs w:val="21"/>
-          <w:color w:val="111111"/>
-        </w:rPr>
-        <w:t xml:space="preserve">Added hybrid keyword and vector retrieval to resolve exact course codes alongside semantic document search.</w:t>
-      </w:r>
-    </w:p>
-    <w:p>
-      <w:pPr>
-        <w:spacing w:before="0" w:after="10" w:line="248" w:lineRule="exact"/>
-        <w:ind w:left="200" w:hanging="200"/>
-      </w:pPr>
-      <w:r>
-        <w:rPr>
-          <w:rFonts w:ascii="Lato" w:hAnsi="Lato" w:cs="Lato"/>
-          <w:sz w:val="21"/>
-          <w:szCs w:val="21"/>
-          <w:color w:val="111111"/>
-        </w:rPr>
-        <w:t xml:space="preserve">•</w:t>
-      </w:r>
-      <w:r>
-        <w:rPr>
-          <w:rFonts w:ascii="Lato" w:hAnsi="Lato" w:cs="Lato"/>
-          <w:sz w:val="21"/>
-          <w:szCs w:val="21"/>
-          <w:color w:val="111111"/>
-        </w:rPr>
-        <w:t xml:space="preserve">  </w:t>
-      </w:r>
-      <w:r>
-        <w:rPr>
-          <w:rFonts w:ascii="Lato" w:hAnsi="Lato" w:cs="Lato"/>
-          <w:sz w:val="21"/>
-          <w:szCs w:val="21"/>
-          <w:color w:val="111111"/>
-        </w:rPr>
-        <w:t xml:space="preserve">Reduced transcript-analysis time from four hours to 15 minutes using a Neo4j knowledge graph and validated Cypher queries.</w:t>
+        <w:t xml:space="preserve">Shipped a multi-tenant RAG assistant to 1,000+ faculty building courses for 60,000+ students, with hybrid vector and keyword search, section-aware chunking and a source citation on every answer.</w:t>
+      </w:r>
+    </w:p>
+    <w:p>
+      <w:pPr>
+        <w:spacing w:before="0" w:after="10" w:line="248" w:lineRule="exact"/>
+        <w:ind w:left="200" w:hanging="200"/>
+      </w:pPr>
+      <w:r>
+        <w:rPr>
+          <w:rFonts w:ascii="Lato" w:hAnsi="Lato" w:cs="Lato"/>
+          <w:sz w:val="21"/>
+          <w:szCs w:val="21"/>
+          <w:color w:val="111111"/>
+        </w:rPr>
+        <w:t xml:space="preserve">•</w:t>
+      </w:r>
+      <w:r>
+        <w:rPr>
+          <w:rFonts w:ascii="Lato" w:hAnsi="Lato" w:cs="Lato"/>
+          <w:sz w:val="21"/>
+          <w:szCs w:val="21"/>
+          <w:color w:val="111111"/>
+        </w:rPr>
+        <w:t xml:space="preserve">  </w:t>
+      </w:r>
+      <w:r>
+        <w:rPr>
+          <w:rFonts w:ascii="Lato" w:hAnsi="Lato" w:cs="Lato"/>
+          <w:sz w:val="21"/>
+          <w:szCs w:val="21"/>
+          <w:color w:val="111111"/>
+        </w:rPr>
+        <w:t xml:space="preserve">Gated every prompt release on Prompt Flow LLM-as-judge evals for groundedness, relevance and coherence.</w:t>
+      </w:r>
+    </w:p>
+    <w:p>
+      <w:pPr>
+        <w:spacing w:before="0" w:after="10" w:line="248" w:lineRule="exact"/>
+        <w:ind w:left="200" w:hanging="200"/>
+      </w:pPr>
+      <w:r>
+        <w:rPr>
+          <w:rFonts w:ascii="Lato" w:hAnsi="Lato" w:cs="Lato"/>
+          <w:sz w:val="21"/>
+          <w:szCs w:val="21"/>
+          <w:color w:val="111111"/>
+        </w:rPr>
+        <w:t xml:space="preserve">•</w:t>
+      </w:r>
+      <w:r>
+        <w:rPr>
+          <w:rFonts w:ascii="Lato" w:hAnsi="Lato" w:cs="Lato"/>
+          <w:sz w:val="21"/>
+          <w:szCs w:val="21"/>
+          <w:color w:val="111111"/>
+        </w:rPr>
+        <w:t xml:space="preserve">  </w:t>
+      </w:r>
+      <w:r>
+        <w:rPr>
+          <w:rFonts w:ascii="Lato" w:hAnsi="Lato" w:cs="Lato"/>
+          <w:sz w:val="21"/>
+          <w:szCs w:val="21"/>
+          <w:color w:val="111111"/>
+        </w:rPr>
+        <w:t xml:space="preserve">Enabled configuration-based college onboarding through tenant-scoped retrieval, keeping each college's documents within its own search boundary.</w:t>
+      </w:r>
+    </w:p>
+    <w:p>
+      <w:pPr>
+        <w:spacing w:before="0" w:after="10" w:line="248" w:lineRule="exact"/>
+        <w:ind w:left="200" w:hanging="200"/>
+      </w:pPr>
+      <w:r>
+        <w:rPr>
+          <w:rFonts w:ascii="Lato" w:hAnsi="Lato" w:cs="Lato"/>
+          <w:sz w:val="21"/>
+          <w:szCs w:val="21"/>
+          <w:color w:val="111111"/>
+        </w:rPr>
+        <w:t xml:space="preserve">•</w:t>
+      </w:r>
+      <w:r>
+        <w:rPr>
+          <w:rFonts w:ascii="Lato" w:hAnsi="Lato" w:cs="Lato"/>
+          <w:sz w:val="21"/>
+          <w:szCs w:val="21"/>
+          <w:color w:val="111111"/>
+        </w:rPr>
+        <w:t xml:space="preserve">  </w:t>
+      </w:r>
+      <w:r>
+        <w:rPr>
+          <w:rFonts w:ascii="Lato" w:hAnsi="Lato" w:cs="Lato"/>
+          <w:sz w:val="21"/>
+          <w:szCs w:val="21"/>
+          <w:color w:val="111111"/>
+        </w:rPr>
+        <w:t xml:space="preserve">Compared fixed-size and section-aware chunking on course documents to preserve complete policy passages in retrieved results.</w:t>
+      </w:r>
+    </w:p>
+    <w:p>
+      <w:pPr>
+        <w:spacing w:before="0" w:after="10" w:line="248" w:lineRule="exact"/>
+        <w:ind w:left="200" w:hanging="200"/>
+      </w:pPr>
+      <w:r>
+        <w:rPr>
+          <w:rFonts w:ascii="Lato" w:hAnsi="Lato" w:cs="Lato"/>
+          <w:sz w:val="21"/>
+          <w:szCs w:val="21"/>
+          <w:color w:val="111111"/>
+        </w:rPr>
+        <w:t xml:space="preserve">•</w:t>
+      </w:r>
+      <w:r>
+        <w:rPr>
+          <w:rFonts w:ascii="Lato" w:hAnsi="Lato" w:cs="Lato"/>
+          <w:sz w:val="21"/>
+          <w:szCs w:val="21"/>
+          <w:color w:val="111111"/>
+        </w:rPr>
+        <w:t xml:space="preserve">  </w:t>
+      </w:r>
+      <w:r>
+        <w:rPr>
+          <w:rFonts w:ascii="Lato" w:hAnsi="Lato" w:cs="Lato"/>
+          <w:sz w:val="21"/>
+          <w:szCs w:val="21"/>
+          <w:color w:val="111111"/>
+        </w:rPr>
+        <w:t xml:space="preserve">Built GraphRAG over a Neo4j knowledge graph with schema-validated, LLM-generated Cypher, cutting transcript analysis from four hours to 15 minutes.</w:t>
       </w:r>
     </w:p>
     <w:p>
@@ -1821,16 +1887,64 @@
           <w:b/>
           <w:color w:val="111111"/>
         </w:rPr>
-        <w:t xml:space="preserve">AI &amp; LLM: </w:t>
-      </w:r>
-      <w:r>
-        <w:rPr>
-          <w:rFonts w:ascii="Lato" w:hAnsi="Lato" w:cs="Lato"/>
-          <w:sz w:val="21"/>
-          <w:szCs w:val="21"/>
-          <w:color w:val="111111"/>
-        </w:rPr>
-        <w:t xml:space="preserve">AWS Bedrock, LangGraph, RAG, LLM evaluation, Prompt Flow, MCP, PyTorch</w:t>
+        <w:t xml:space="preserve">AI Engineering: </w:t>
+      </w:r>
+      <w:r>
+        <w:rPr>
+          <w:rFonts w:ascii="Lato" w:hAnsi="Lato" w:cs="Lato"/>
+          <w:sz w:val="21"/>
+          <w:szCs w:val="21"/>
+          <w:color w:val="111111"/>
+        </w:rPr>
+        <w:t xml:space="preserve">Multi-agent systems, tool calling, agentic RAG, GraphRAG, hybrid search, context engineering, structured outputs, guardrails, prompt caching, human-in-the-loop</w:t>
+      </w:r>
+    </w:p>
+    <w:p>
+      <w:pPr>
+        <w:spacing w:before="0" w:after="10" w:line="248" w:lineRule="exact"/>
+      </w:pPr>
+      <w:r>
+        <w:rPr>
+          <w:rFonts w:ascii="Lato" w:hAnsi="Lato" w:cs="Lato"/>
+          <w:sz w:val="21"/>
+          <w:szCs w:val="21"/>
+          <w:b/>
+          <w:color w:val="111111"/>
+        </w:rPr>
+        <w:t xml:space="preserve">Evals &amp; Observability: </w:t>
+      </w:r>
+      <w:r>
+        <w:rPr>
+          <w:rFonts w:ascii="Lato" w:hAnsi="Lato" w:cs="Lato"/>
+          <w:sz w:val="21"/>
+          <w:szCs w:val="21"/>
+          <w:color w:val="111111"/>
+        </w:rPr>
+        <w:t xml:space="preserve">LLM-as-judge, code-scored benchmarks, golden datasets, Prompt Flow, Logfire, OpenTelemetry, distributed tracing, CloudWatch</w:t>
+      </w:r>
+    </w:p>
+    <w:p>
+      <w:pPr>
+        <w:spacing w:before="0" w:after="10" w:line="248" w:lineRule="exact"/>
+      </w:pPr>
+      <w:r>
+        <w:rPr>
+          <w:rFonts w:ascii="Lato" w:hAnsi="Lato" w:cs="Lato"/>
+          <w:sz w:val="21"/>
+          <w:szCs w:val="21"/>
+          <w:b/>
+          <w:color w:val="111111"/>
+        </w:rPr>
+        <w:t xml:space="preserve">Models &amp; Frameworks: </w:t>
+      </w:r>
+      <w:r>
+        <w:rPr>
+          <w:rFonts w:ascii="Lato" w:hAnsi="Lato" w:cs="Lato"/>
+          <w:sz w:val="21"/>
+          <w:szCs w:val="21"/>
+          <w:color w:val="111111"/>
+        </w:rPr>
+        <w:t xml:space="preserve">AWS Bedrock, OpenAI, Gemini, LangGraph, LangChain, Semantic Kernel, MCP, PyTorch</w:t>
       </w:r>
     </w:p>
     <w:p>
@@ -1854,7 +1968,7 @@
           <w:szCs w:val="21"/>
           <w:color w:val="111111"/>
         </w:rPr>
-        <w:t xml:space="preserve">PostgreSQL, pgvector, FAISS, Neo4j, Redis, Algolia, Firestore</w:t>
+        <w:t xml:space="preserve">pgvector, FAISS, Lance, Neo4j, DuckDB, PostgreSQL, Redis, Algolia, Firestore</w:t>
       </w:r>
     </w:p>
     <w:p>

</xml_diff>

<commit_message>
Cover common job requirements in every role resume
Skills lines now list every tool already used across work and projects
(Django, Flask, Java, Angular, Tailwind, DynamoDB, MySQL, scikit-learn,
XGBoost, TensorFlow, GitHub Actions, Vercel, Cloudflare Workers) plus
the market terms for work already done (prompt engineering, fine-tuning,
A/B testing, forecasting, data modeling, microservices).

Six existing portfolio projects join the resume pool, and each family
picks its best fit: Clash Royale Analytics for full stack and data
engineering, Serverless Document Pipeline for backend, Soccer Result
Prediction for data science. One-page picks were trimmed to keep every
variant at one and two pages.
</commit_message>
<xml_diff>
--- a/public/Archit_Agrawal_AI_Software_Engineer_Resume.docx
+++ b/public/Archit_Agrawal_AI_Software_Engineer_Resume.docx
@@ -1834,6 +1834,39 @@
     </w:p>
     <w:p>
       <w:pPr>
+        <w:spacing w:before="0" w:after="10" w:line="248" w:lineRule="exact"/>
+        <w:ind w:left="200" w:hanging="200"/>
+      </w:pPr>
+      <w:r>
+        <w:rPr>
+          <w:rFonts w:ascii="Lato" w:hAnsi="Lato" w:cs="Lato"/>
+          <w:sz w:val="21"/>
+          <w:szCs w:val="21"/>
+          <w:color w:val="111111"/>
+        </w:rPr>
+        <w:t xml:space="preserve">•</w:t>
+      </w:r>
+      <w:r>
+        <w:rPr>
+          <w:rFonts w:ascii="Lato" w:hAnsi="Lato" w:cs="Lato"/>
+          <w:sz w:val="21"/>
+          <w:szCs w:val="21"/>
+          <w:color w:val="111111"/>
+        </w:rPr>
+        <w:t xml:space="preserve">  </w:t>
+      </w:r>
+      <w:r>
+        <w:rPr>
+          <w:rFonts w:ascii="Lato" w:hAnsi="Lato" w:cs="Lato"/>
+          <w:sz w:val="21"/>
+          <w:szCs w:val="21"/>
+          <w:color w:val="111111"/>
+        </w:rPr>
+        <w:t xml:space="preserve">Fine-tuned with DPO, KTO and IPO preference training; reduced DPO training loss from 0.68 to 0.47 on labeled pairs.</w:t>
+      </w:r>
+    </w:p>
+    <w:p>
+      <w:pPr>
         <w:keepNext/>
         <w:pBdr>
           <w:bottom w:val="single" w:sz="4" w:space="1" w:color="999999"/>
@@ -1896,7 +1929,7 @@
           <w:szCs w:val="21"/>
           <w:color w:val="111111"/>
         </w:rPr>
-        <w:t xml:space="preserve">Multi-agent systems, tool calling, agentic RAG, GraphRAG, hybrid search, context engineering, structured outputs, guardrails, prompt caching, human-in-the-loop</w:t>
+        <w:t xml:space="preserve">AI agents, multi-agent systems, tool calling, agentic RAG, GraphRAG, hybrid search, context engineering, prompt engineering, structured outputs, guardrails, prompt caching, human-in-the-loop</w:t>
       </w:r>
     </w:p>
     <w:p>
@@ -1920,7 +1953,7 @@
           <w:szCs w:val="21"/>
           <w:color w:val="111111"/>
         </w:rPr>
-        <w:t xml:space="preserve">LLM-as-judge, code-scored benchmarks, golden datasets, Prompt Flow, Logfire, OpenTelemetry, distributed tracing, CloudWatch</w:t>
+        <w:t xml:space="preserve">LLM evals, LLM-as-judge, code-scored benchmarks, golden datasets, Prompt Flow, LLMOps, Logfire, OpenTelemetry, CloudWatch</w:t>
       </w:r>
     </w:p>
     <w:p>
@@ -1944,7 +1977,31 @@
           <w:szCs w:val="21"/>
           <w:color w:val="111111"/>
         </w:rPr>
-        <w:t xml:space="preserve">AWS Bedrock, OpenAI, Gemini, LangGraph, LangChain, Semantic Kernel, MCP, PyTorch</w:t>
+        <w:t xml:space="preserve">OpenAI, AWS Bedrock, Gemini, LangGraph, LangChain, Semantic Kernel, MCP, Hugging Face, llama.cpp</w:t>
+      </w:r>
+    </w:p>
+    <w:p>
+      <w:pPr>
+        <w:spacing w:before="0" w:after="10" w:line="248" w:lineRule="exact"/>
+      </w:pPr>
+      <w:r>
+        <w:rPr>
+          <w:rFonts w:ascii="Lato" w:hAnsi="Lato" w:cs="Lato"/>
+          <w:sz w:val="21"/>
+          <w:szCs w:val="21"/>
+          <w:b/>
+          <w:color w:val="111111"/>
+        </w:rPr>
+        <w:t xml:space="preserve">ML &amp; Training: </w:t>
+      </w:r>
+      <w:r>
+        <w:rPr>
+          <w:rFonts w:ascii="Lato" w:hAnsi="Lato" w:cs="Lato"/>
+          <w:sz w:val="21"/>
+          <w:szCs w:val="21"/>
+          <w:color w:val="111111"/>
+        </w:rPr>
+        <w:t xml:space="preserve">PyTorch, fine-tuning (DPO, KTO), reward models, embeddings, CUDA, ROCm</w:t>
       </w:r>
     </w:p>
     <w:p>
@@ -1968,55 +2025,31 @@
           <w:szCs w:val="21"/>
           <w:color w:val="111111"/>
         </w:rPr>
-        <w:t xml:space="preserve">pgvector, FAISS, Lance, Neo4j, DuckDB, PostgreSQL, Redis, Algolia, Firestore</w:t>
-      </w:r>
-    </w:p>
-    <w:p>
-      <w:pPr>
-        <w:spacing w:before="0" w:after="10" w:line="248" w:lineRule="exact"/>
-      </w:pPr>
-      <w:r>
-        <w:rPr>
-          <w:rFonts w:ascii="Lato" w:hAnsi="Lato" w:cs="Lato"/>
-          <w:sz w:val="21"/>
-          <w:szCs w:val="21"/>
-          <w:b/>
-          <w:color w:val="111111"/>
-        </w:rPr>
-        <w:t xml:space="preserve">Backend &amp; Web: </w:t>
-      </w:r>
-      <w:r>
-        <w:rPr>
-          <w:rFonts w:ascii="Lato" w:hAnsi="Lato" w:cs="Lato"/>
-          <w:sz w:val="21"/>
-          <w:szCs w:val="21"/>
-          <w:color w:val="111111"/>
-        </w:rPr>
-        <w:t xml:space="preserve">FastAPI, NestJS, Node.js, .NET, React, Nuxt</w:t>
-      </w:r>
-    </w:p>
-    <w:p>
-      <w:pPr>
-        <w:spacing w:before="0" w:after="10" w:line="248" w:lineRule="exact"/>
-      </w:pPr>
-      <w:r>
-        <w:rPr>
-          <w:rFonts w:ascii="Lato" w:hAnsi="Lato" w:cs="Lato"/>
-          <w:sz w:val="21"/>
-          <w:szCs w:val="21"/>
-          <w:b/>
-          <w:color w:val="111111"/>
-        </w:rPr>
-        <w:t xml:space="preserve">Cloud &amp; Quality: </w:t>
-      </w:r>
-      <w:r>
-        <w:rPr>
-          <w:rFonts w:ascii="Lato" w:hAnsi="Lato" w:cs="Lato"/>
-          <w:sz w:val="21"/>
-          <w:szCs w:val="21"/>
-          <w:color w:val="111111"/>
-        </w:rPr>
-        <w:t xml:space="preserve">AWS (Step Functions, Lambda, S3, CDK), GCP Cloud Run, Docker, Kubernetes, CI/CD, pytest</w:t>
+        <w:t xml:space="preserve">Vector databases (pgvector, FAISS, Lance), Neo4j, DuckDB, PostgreSQL, Redis, Algolia, Firestore</w:t>
+      </w:r>
+    </w:p>
+    <w:p>
+      <w:pPr>
+        <w:spacing w:before="0" w:after="10" w:line="248" w:lineRule="exact"/>
+      </w:pPr>
+      <w:r>
+        <w:rPr>
+          <w:rFonts w:ascii="Lato" w:hAnsi="Lato" w:cs="Lato"/>
+          <w:sz w:val="21"/>
+          <w:szCs w:val="21"/>
+          <w:b/>
+          <w:color w:val="111111"/>
+        </w:rPr>
+        <w:t xml:space="preserve">Backend &amp; Cloud: </w:t>
+      </w:r>
+      <w:r>
+        <w:rPr>
+          <w:rFonts w:ascii="Lato" w:hAnsi="Lato" w:cs="Lato"/>
+          <w:sz w:val="21"/>
+          <w:szCs w:val="21"/>
+          <w:color w:val="111111"/>
+        </w:rPr>
+        <w:t xml:space="preserve">FastAPI, NestJS, Node.js, AWS (Step Functions, Lambda, S3, CDK), GCP Cloud Run, Docker, Kubernetes, GitHub Actions, pytest</w:t>
       </w:r>
     </w:p>
     <w:p>

</xml_diff>